<commit_message>
STATKOM Week 8 - Mid Term
</commit_message>
<xml_diff>
--- a/web-lanjut/week-8/Week8-ExportImport.docx
+++ b/web-lanjut/week-8/Week8-ExportImport.docx
@@ -4990,6 +4990,79 @@
           <w:color w:val="000000" w:themeColor="text1"/>
         </w:rPr>
         <w:t xml:space="preserve"> field. The view displays file-type input with validation error handling, and the route uses the PATCH method to process the profile photo update request via the URL /profile-picture/update.</w:t>
+      </w:r>
+    </w:p>
+    <w:p>
+      <w:pPr>
+        <w:spacing w:line="360" w:lineRule="auto"/>
+        <w:jc w:val="both"/>
+        <w:rPr>
+          <w:rFonts w:ascii="Times New Roman" w:hAnsi="Times New Roman" w:cs="Times New Roman"/>
+          <w:color w:val="000000" w:themeColor="text1"/>
+        </w:rPr>
+      </w:pPr>
+    </w:p>
+    <w:p>
+      <w:pPr>
+        <w:spacing w:line="360" w:lineRule="auto"/>
+        <w:jc w:val="both"/>
+        <w:rPr>
+          <w:rFonts w:ascii="Times New Roman" w:hAnsi="Times New Roman" w:cs="Times New Roman"/>
+          <w:color w:val="000000" w:themeColor="text1"/>
+        </w:rPr>
+      </w:pPr>
+      <w:r>
+        <w:rPr>
+          <w:rFonts w:ascii="Times New Roman" w:hAnsi="Times New Roman" w:cs="Times New Roman"/>
+          <w:noProof/>
+          <w:color w:val="000000" w:themeColor="text1"/>
+        </w:rPr>
+        <w:drawing>
+          <wp:inline distT="0" distB="0" distL="0" distR="0">
+            <wp:extent cx="5943600" cy="391795"/>
+            <wp:effectExtent l="12700" t="12700" r="12700" b="14605"/>
+            <wp:docPr id="681172806" name="Picture 12"/>
+            <wp:cNvGraphicFramePr>
+              <a:graphicFrameLocks xmlns:a="http://schemas.openxmlformats.org/drawingml/2006/main" noChangeAspect="1"/>
+            </wp:cNvGraphicFramePr>
+            <a:graphic xmlns:a="http://schemas.openxmlformats.org/drawingml/2006/main">
+              <a:graphicData uri="http://schemas.openxmlformats.org/drawingml/2006/picture">
+                <pic:pic xmlns:pic="http://schemas.openxmlformats.org/drawingml/2006/picture">
+                  <pic:nvPicPr>
+                    <pic:cNvPr id="681172806" name="Picture 681172806"/>
+                    <pic:cNvPicPr/>
+                  </pic:nvPicPr>
+                  <pic:blipFill>
+                    <a:blip r:embed="rId52" cstate="print">
+                      <a:extLst>
+                        <a:ext uri="{28A0092B-C50C-407E-A947-70E740481C1C}">
+                          <a14:useLocalDpi xmlns:a14="http://schemas.microsoft.com/office/drawing/2010/main" val="0"/>
+                        </a:ext>
+                      </a:extLst>
+                    </a:blip>
+                    <a:stretch>
+                      <a:fillRect/>
+                    </a:stretch>
+                  </pic:blipFill>
+                  <pic:spPr>
+                    <a:xfrm>
+                      <a:off x="0" y="0"/>
+                      <a:ext cx="5943600" cy="391795"/>
+                    </a:xfrm>
+                    <a:prstGeom prst="rect">
+                      <a:avLst/>
+                    </a:prstGeom>
+                    <a:ln>
+                      <a:solidFill>
+                        <a:schemeClr val="tx1"/>
+                      </a:solidFill>
+                    </a:ln>
+                  </pic:spPr>
+                </pic:pic>
+              </a:graphicData>
+            </a:graphic>
+          </wp:inline>
+        </w:drawing>
       </w:r>
     </w:p>
     <w:sectPr>

</xml_diff>